<commit_message>
EVE-246: update US-market Newlands 2027 cricket package Word doc (v1 revision)
Refreshed Newlands_2027_US_Version_v1.docx with latest draft — US-market
version for Ashley Horobin, Eventra Group USA. Not for the live site.
Awaiting Colin review and FX peg confirmation before distribution.

Co-Authored-By: Paperclip <noreply@paperclip.ing>
</commit_message>
<xml_diff>
--- a/Newlands_2027_US_Version_v1.docx
+++ b/Newlands_2027_US_Version_v1.docx
@@ -2,39 +2,6 @@
 <file path=word/document.xml><?xml version="1.0" encoding="utf-8"?>
 <w:document xmlns:wpc="http://schemas.microsoft.com/office/word/2010/wordprocessingCanvas" xmlns:mo="http://schemas.microsoft.com/office/mac/office/2008/main" xmlns:mc="http://schemas.openxmlformats.org/markup-compatibility/2006" xmlns:mv="urn:schemas-microsoft-com:mac:vml" xmlns:o="urn:schemas-microsoft-com:office:office" xmlns:r="http://schemas.openxmlformats.org/officeDocument/2006/relationships" xmlns:m="http://schemas.openxmlformats.org/officeDocument/2006/math" xmlns:v="urn:schemas-microsoft-com:vml" xmlns:wp14="http://schemas.microsoft.com/office/word/2010/wordprocessingDrawing" xmlns:wp="http://schemas.openxmlformats.org/drawingml/2006/wordprocessingDrawing" xmlns:w10="urn:schemas-microsoft-com:office:word" xmlns:w="http://schemas.openxmlformats.org/wordprocessingml/2006/main" xmlns:w14="http://schemas.microsoft.com/office/word/2010/wordml" xmlns:wpg="http://schemas.microsoft.com/office/word/2010/wordprocessingGroup" xmlns:wpi="http://schemas.microsoft.com/office/word/2010/wordprocessingInk" xmlns:wne="http://schemas.microsoft.com/office/word/2006/wordml" xmlns:wps="http://schemas.microsoft.com/office/word/2010/wordprocessingShape" mc:Ignorable="w14 wp14">
   <w:body>
-    <w:p>
-      <w:pPr>
-        <w:spacing w:before="200" w:after="80"/>
-      </w:pPr>
-      <w:r>
-        <w:rPr>
-          <w:rFonts w:ascii="Calibri" w:hAnsi="Calibri"/>
-          <w:b/>
-          <w:i w:val="0"/>
-          <w:color w:val="B8966B"/>
-          <w:sz w:val="17"/>
-        </w:rPr>
-        <w:t>EVENTRA GROUP  ·  LUXURY CRICKET PACKAGE  ·  CAPE TOWN 2026–2027</w:t>
-      </w:r>
-    </w:p>
-    <w:p>
-      <w:pPr>
-        <w:spacing w:before="120" w:after="200"/>
-        <w:jc w:val="left"/>
-      </w:pPr>
-      <w:r>
-        <w:rPr>
-          <w:rFonts w:ascii="Garamond" w:hAnsi="Garamond"/>
-          <w:b w:val="0"/>
-          <w:i w:val="0"/>
-          <w:color w:val="1B4332"/>
-          <w:sz w:val="60"/>
-        </w:rPr>
-        <w:t>10 Days in Cape Town. 5 Days of Test Cricket.</w:t>
-        <w:br/>
-        <w:t>One Unforgettable New Year's.</w:t>
-      </w:r>
-    </w:p>
     <w:p>
       <w:pPr>
         <w:spacing w:before="0" w:after="80"/>
@@ -42,125 +9,152 @@
       </w:pPr>
       <w:r>
         <w:rPr>
-          <w:rFonts w:ascii="Garamond" w:hAnsi="Garamond"/>
+          <w:b/>
+          <w:i w:val="0"/>
+          <w:color w:val="B8966B"/>
+          <w:sz w:val="18"/>
+        </w:rPr>
+        <w:t>EVENTRA GROUP  —  US MARKET VERSION  —  DRAFT v1</w:t>
+      </w:r>
+    </w:p>
+    <w:p>
+      <w:pPr>
+        <w:spacing w:before="0" w:after="280"/>
+        <w:jc w:val="left"/>
+      </w:pPr>
+      <w:r>
+        <w:rPr>
+          <w:b w:val="0"/>
+          <w:i/>
+          <w:color w:val="6B6B6B"/>
+          <w:sz w:val="18"/>
+        </w:rPr>
+        <w:t>CONFIDENTIAL: For Ashley Horobin, Eventra Group USA. Not for publication.</w:t>
+      </w:r>
+    </w:p>
+    <w:p>
+      <w:pPr>
+        <w:spacing w:before="160" w:after="160"/>
+        <w:pBdr>
+          <w:bottom w:val="single" w:sz="4" w:space="1" w:color="B8966B"/>
+        </w:pBdr>
+      </w:pPr>
+    </w:p>
+    <w:p>
+      <w:pPr>
+        <w:spacing w:before="280" w:after="160"/>
+        <w:jc w:val="left"/>
+      </w:pPr>
+      <w:r>
+        <w:rPr>
+          <w:b/>
+          <w:color w:val="1A1A1A"/>
+          <w:sz w:val="52"/>
+        </w:rPr>
+        <w:t>10 Days in Cape Town. 5 Days of Test Cricket. One Unforgettable New Year's.</w:t>
+      </w:r>
+    </w:p>
+    <w:p>
+      <w:pPr>
+        <w:spacing w:before="0" w:after="240"/>
+        <w:jc w:val="left"/>
+      </w:pPr>
+      <w:r>
+        <w:rPr>
           <w:b w:val="0"/>
           <w:i/>
           <w:color w:val="6B6B6B"/>
           <w:sz w:val="28"/>
         </w:rPr>
-        <w:t>Your private VIP suite. Your beachfront city.</w:t>
-        <w:br/>
-        <w:t>Your front-row seat to one of the world's great sporting traditions.</w:t>
+        <w:t>Your private VIP suite. Your beachfront city. Your front-row seat to one of the world's great sporting traditions.</w:t>
       </w:r>
     </w:p>
     <w:p>
       <w:pPr>
-        <w:spacing w:before="120" w:after="120"/>
+        <w:spacing w:before="160" w:after="160"/>
         <w:pBdr>
-          <w:bottom w:val="single" w:sz="6" w:space="1" w:color="B8966B"/>
+          <w:bottom w:val="single" w:sz="4" w:space="1" w:color="B8966B"/>
         </w:pBdr>
       </w:pPr>
     </w:p>
     <w:p>
       <w:pPr>
-        <w:spacing w:before="240" w:after="120"/>
+        <w:spacing w:before="200" w:after="200"/>
+        <w:jc w:val="left"/>
       </w:pPr>
       <w:r>
         <w:rPr>
-          <w:rFonts w:ascii="Garamond" w:hAnsi="Garamond"/>
-          <w:b w:val="0"/>
+          <w:b/>
+          <w:i w:val="0"/>
           <w:color w:val="1A1A1A"/>
-          <w:sz w:val="30"/>
+          <w:sz w:val="26"/>
         </w:rPr>
         <w:t>Most cricket tours give you the cricket. This one gives you Cape Town.</w:t>
       </w:r>
     </w:p>
     <w:p>
       <w:pPr>
-        <w:spacing w:before="80" w:after="240"/>
+        <w:spacing w:before="0" w:after="200"/>
+        <w:jc w:val="left"/>
       </w:pPr>
       <w:r>
         <w:rPr>
-          <w:rFonts w:ascii="Calibri" w:hAnsi="Calibri"/>
-          <w:b/>
+          <w:b w:val="0"/>
+          <w:i/>
           <w:color w:val="B8966B"/>
-          <w:sz w:val="20"/>
+          <w:sz w:val="22"/>
         </w:rPr>
-        <w:t>Cape Town — voted World's Best City by Travel + Leisure readers.</w:t>
+        <w:t>Cape Town — voted World’s Best City by Travel + Leisure readers.</w:t>
       </w:r>
     </w:p>
     <w:p>
       <w:pPr>
-        <w:spacing w:before="200" w:after="80"/>
-      </w:pPr>
-      <w:r>
-        <w:rPr>
-          <w:rFonts w:ascii="Calibri" w:hAnsi="Calibri"/>
-          <w:b/>
-          <w:i w:val="0"/>
-          <w:color w:val="B8966B"/>
-          <w:sz w:val="17"/>
-        </w:rPr>
-        <w:t>ABOUT THE NEWLANDS TEST</w:t>
-      </w:r>
-    </w:p>
-    <w:p>
-      <w:pPr>
-        <w:spacing w:before="40" w:after="280"/>
+        <w:spacing w:before="0" w:after="280"/>
         <w:jc w:val="left"/>
       </w:pPr>
       <w:r>
         <w:rPr>
-          <w:rFonts w:ascii="Calibri" w:hAnsi="Calibri"/>
+          <w:b w:val="0"/>
           <w:i w:val="0"/>
           <w:color w:val="1A1A1A"/>
-          <w:sz w:val="23"/>
+          <w:sz w:val="22"/>
         </w:rPr>
         <w:t>Held every year between Christmas and New Year, the Newlands Test is to South African summer what the Masters is to Augusta — a fixture on the world sporting calendar, played at one of the most beautiful grounds in the game, against the Table Mountain skyline.</w:t>
       </w:r>
     </w:p>
     <w:p>
       <w:pPr>
-        <w:spacing w:before="200" w:after="80"/>
+        <w:spacing w:before="320" w:after="120"/>
+        <w:jc w:val="left"/>
       </w:pPr>
       <w:r>
         <w:rPr>
-          <w:rFonts w:ascii="Calibri" w:hAnsi="Calibri"/>
           <w:b/>
-          <w:i w:val="0"/>
-          <w:color w:val="B8966B"/>
-          <w:sz w:val="17"/>
+          <w:color w:val="1A1A1A"/>
+          <w:sz w:val="36"/>
         </w:rPr>
-        <w:t>THE PACKAGE</w:t>
+        <w:t>The Package</w:t>
       </w:r>
     </w:p>
     <w:p>
       <w:pPr>
-        <w:spacing w:before="80" w:after="160"/>
+        <w:spacing w:before="160" w:after="160"/>
+        <w:pBdr>
+          <w:bottom w:val="single" w:sz="4" w:space="1" w:color="B8966B"/>
+        </w:pBdr>
+      </w:pPr>
+    </w:p>
+    <w:p>
+      <w:pPr>
+        <w:spacing w:before="160" w:after="160"/>
         <w:jc w:val="left"/>
       </w:pPr>
       <w:r>
         <w:rPr>
-          <w:rFonts w:ascii="Garamond" w:hAnsi="Garamond"/>
           <w:b w:val="0"/>
           <w:i w:val="0"/>
-          <w:color w:val="1B4332"/>
-          <w:sz w:val="48"/>
-        </w:rPr>
-        <w:t>Ten Days. One Package.</w:t>
-      </w:r>
-    </w:p>
-    <w:p>
-      <w:pPr>
-        <w:spacing w:before="0" w:after="160"/>
-        <w:jc w:val="left"/>
-      </w:pPr>
-      <w:r>
-        <w:rPr>
-          <w:rFonts w:ascii="Calibri" w:hAnsi="Calibri"/>
-          <w:i w:val="0"/>
           <w:color w:val="1A1A1A"/>
-          <w:sz w:val="23"/>
+          <w:sz w:val="22"/>
         </w:rPr>
         <w:t>There is a version of a cricket tour that ends at the boundary rope. And there is this one.</w:t>
       </w:r>
@@ -172,12 +166,12 @@
       </w:pPr>
       <w:r>
         <w:rPr>
-          <w:rFonts w:ascii="Calibri" w:hAnsi="Calibri"/>
+          <w:b w:val="0"/>
           <w:i w:val="0"/>
           <w:color w:val="1A1A1A"/>
-          <w:sz w:val="23"/>
+          <w:sz w:val="22"/>
         </w:rPr>
-        <w:t>The Eventra England vs South Africa Third Test package is built around a simple idea: the most enduring experiences are the ones where the city is part of the event. Cape Town in late December is not a backdrop. It is the reason to come. The winelands in summer, the Atlantic coast at the turn of the year, Table Mountain on a clear morning — these aren't incidental additions to a cricket itinerary. They are why this particular ten days holds together.</w:t>
+        <w:t>The Eventra England vs South Africa Third Test package is built around a simple premise: that the most enduring experiences are the ones where the city itself is part of the event. Cape Town in late December is not a backdrop. It is the reason to come. The winelands in summer, the Atlantic coast at the turn of the year, Table Mountain on a clear morning — these are not incidental additions to a cricket itinerary. They are why this particular ten days holds together.</w:t>
       </w:r>
     </w:p>
     <w:p>
@@ -187,441 +181,262 @@
       </w:pPr>
       <w:r>
         <w:rPr>
-          <w:rFonts w:ascii="Calibri" w:hAnsi="Calibri"/>
+          <w:b w:val="0"/>
           <w:i w:val="0"/>
           <w:color w:val="1A1A1A"/>
-          <w:sz w:val="23"/>
+          <w:sz w:val="22"/>
         </w:rPr>
-        <w:t>The cricket arrives on Day 6, when Newlands stages the Third Test. Your own 24-guest private VIP suite inside the Members Pavilion — full hospitality, prime sightlines, and the only entrance Newlands locals ever envy. The five days before are spent in one of Africa's most remarkable cities, at a pace that makes the cricket feel earned when it arrives.</w:t>
+        <w:t>The cricket comes in at Day 6, when Newlands stages the Third Test between England and South Africa. Eventra’s private VIP suite places you at the ground with access the general ticket does not provide — curated hospitality, the right company, and none of the compromise. The days before it are spent in one of Africa’s most remarkable cities, at a pace and with an arrangement that makes the cricket feel earned when it arrives.</w:t>
       </w:r>
     </w:p>
     <w:p>
       <w:pPr>
-        <w:spacing w:before="0" w:after="240"/>
+        <w:spacing w:before="0" w:after="160"/>
         <w:jc w:val="left"/>
       </w:pPr>
       <w:r>
         <w:rPr>
-          <w:rFonts w:ascii="Calibri" w:hAnsi="Calibri"/>
+          <w:b w:val="0"/>
           <w:i w:val="0"/>
           <w:color w:val="1A1A1A"/>
-          <w:sz w:val="23"/>
+          <w:sz w:val="22"/>
         </w:rPr>
-        <w:t>Base hotel throughout: Hyatt Regency Cape Town — central, well-positioned, and exactly what it needs to be.</w:t>
-      </w:r>
-    </w:p>
-    <w:tbl>
-      <w:tblPr>
-        <w:tblStyle w:val="TableGrid"/>
-        <w:tblW w:type="auto" w:w="0"/>
-        <w:jc w:val="left"/>
-        <w:tblLook w:firstColumn="1" w:firstRow="1" w:lastColumn="0" w:lastRow="0" w:noHBand="0" w:noVBand="1" w:val="04A0"/>
-      </w:tblPr>
-      <w:tblGrid>
-        <w:gridCol w:w="4320"/>
-        <w:gridCol w:w="4320"/>
-      </w:tblGrid>
-      <w:tr>
-        <w:tc>
-          <w:tcPr>
-            <w:tcW w:type="dxa" w:w="2304"/>
-            <w:tcBorders>
-              <w:top w:val="single" w:sz="4" w:color="DDDDDD"/>
-              <w:left w:val="single" w:sz="4" w:color="DDDDDD"/>
-              <w:bottom w:val="single" w:sz="4" w:color="DDDDDD"/>
-              <w:right w:val="single" w:sz="4" w:color="DDDDDD"/>
-            </w:tcBorders>
-          </w:tcPr>
-          <w:p>
-            <w:pPr>
-              <w:spacing w:before="80" w:after="80"/>
-            </w:pPr>
-            <w:r>
-              <w:rPr>
-                <w:rFonts w:ascii="Calibri" w:hAnsi="Calibri"/>
-                <w:b/>
-                <w:color w:val="B8966B"/>
-                <w:sz w:val="17"/>
-              </w:rPr>
-              <w:t>PACKAGE</w:t>
-            </w:r>
-          </w:p>
-        </w:tc>
-        <w:tc>
-          <w:tcPr>
-            <w:tcW w:type="dxa" w:w="4320"/>
-            <w:tcBorders>
-              <w:top w:val="single" w:sz="4" w:color="DDDDDD"/>
-              <w:left w:val="single" w:sz="4" w:color="DDDDDD"/>
-              <w:bottom w:val="single" w:sz="4" w:color="DDDDDD"/>
-              <w:right w:val="single" w:sz="4" w:color="DDDDDD"/>
-            </w:tcBorders>
-          </w:tcPr>
-          <w:p>
-            <w:pPr>
-              <w:spacing w:before="80" w:after="80"/>
-            </w:pPr>
-            <w:r>
-              <w:rPr>
-                <w:rFonts w:ascii="Calibri" w:hAnsi="Calibri"/>
-                <w:color w:val="1A1A1A"/>
-                <w:sz w:val="21"/>
-              </w:rPr>
-              <w:t>England vs South Africa — Third Test</w:t>
-            </w:r>
-          </w:p>
-        </w:tc>
-      </w:tr>
-      <w:tr>
-        <w:tc>
-          <w:tcPr>
-            <w:tcW w:type="dxa" w:w="2304"/>
-            <w:tcBorders>
-              <w:top w:val="single" w:sz="4" w:color="DDDDDD"/>
-              <w:left w:val="single" w:sz="4" w:color="DDDDDD"/>
-              <w:bottom w:val="single" w:sz="4" w:color="DDDDDD"/>
-              <w:right w:val="single" w:sz="4" w:color="DDDDDD"/>
-            </w:tcBorders>
-          </w:tcPr>
-          <w:p>
-            <w:pPr>
-              <w:spacing w:before="80" w:after="80"/>
-            </w:pPr>
-            <w:r>
-              <w:rPr>
-                <w:rFonts w:ascii="Calibri" w:hAnsi="Calibri"/>
-                <w:b/>
-                <w:color w:val="B8966B"/>
-                <w:sz w:val="17"/>
-              </w:rPr>
-              <w:t>DATES</w:t>
-            </w:r>
-          </w:p>
-        </w:tc>
-        <w:tc>
-          <w:tcPr>
-            <w:tcW w:type="dxa" w:w="4320"/>
-            <w:tcBorders>
-              <w:top w:val="single" w:sz="4" w:color="DDDDDD"/>
-              <w:left w:val="single" w:sz="4" w:color="DDDDDD"/>
-              <w:bottom w:val="single" w:sz="4" w:color="DDDDDD"/>
-              <w:right w:val="single" w:sz="4" w:color="DDDDDD"/>
-            </w:tcBorders>
-          </w:tcPr>
-          <w:p>
-            <w:pPr>
-              <w:spacing w:before="80" w:after="80"/>
-            </w:pPr>
-            <w:r>
-              <w:rPr>
-                <w:rFonts w:ascii="Calibri" w:hAnsi="Calibri"/>
-                <w:color w:val="1A1A1A"/>
-                <w:sz w:val="21"/>
-              </w:rPr>
-              <w:t>December 29, 2026 – January 7, 2027</w:t>
-            </w:r>
-          </w:p>
-        </w:tc>
-      </w:tr>
-      <w:tr>
-        <w:tc>
-          <w:tcPr>
-            <w:tcW w:type="dxa" w:w="2304"/>
-            <w:tcBorders>
-              <w:top w:val="single" w:sz="4" w:color="DDDDDD"/>
-              <w:left w:val="single" w:sz="4" w:color="DDDDDD"/>
-              <w:bottom w:val="single" w:sz="4" w:color="DDDDDD"/>
-              <w:right w:val="single" w:sz="4" w:color="DDDDDD"/>
-            </w:tcBorders>
-          </w:tcPr>
-          <w:p>
-            <w:pPr>
-              <w:spacing w:before="80" w:after="80"/>
-            </w:pPr>
-            <w:r>
-              <w:rPr>
-                <w:rFonts w:ascii="Calibri" w:hAnsi="Calibri"/>
-                <w:b/>
-                <w:color w:val="B8966B"/>
-                <w:sz w:val="17"/>
-              </w:rPr>
-              <w:t>DURATION</w:t>
-            </w:r>
-          </w:p>
-        </w:tc>
-        <w:tc>
-          <w:tcPr>
-            <w:tcW w:type="dxa" w:w="4320"/>
-            <w:tcBorders>
-              <w:top w:val="single" w:sz="4" w:color="DDDDDD"/>
-              <w:left w:val="single" w:sz="4" w:color="DDDDDD"/>
-              <w:bottom w:val="single" w:sz="4" w:color="DDDDDD"/>
-              <w:right w:val="single" w:sz="4" w:color="DDDDDD"/>
-            </w:tcBorders>
-          </w:tcPr>
-          <w:p>
-            <w:pPr>
-              <w:spacing w:before="80" w:after="80"/>
-            </w:pPr>
-            <w:r>
-              <w:rPr>
-                <w:rFonts w:ascii="Calibri" w:hAnsi="Calibri"/>
-                <w:color w:val="1A1A1A"/>
-                <w:sz w:val="21"/>
-              </w:rPr>
-              <w:t>10 nights</w:t>
-            </w:r>
-          </w:p>
-        </w:tc>
-      </w:tr>
-      <w:tr>
-        <w:tc>
-          <w:tcPr>
-            <w:tcW w:type="dxa" w:w="2304"/>
-            <w:tcBorders>
-              <w:top w:val="single" w:sz="4" w:color="DDDDDD"/>
-              <w:left w:val="single" w:sz="4" w:color="DDDDDD"/>
-              <w:bottom w:val="single" w:sz="4" w:color="DDDDDD"/>
-              <w:right w:val="single" w:sz="4" w:color="DDDDDD"/>
-            </w:tcBorders>
-          </w:tcPr>
-          <w:p>
-            <w:pPr>
-              <w:spacing w:before="80" w:after="80"/>
-            </w:pPr>
-            <w:r>
-              <w:rPr>
-                <w:rFonts w:ascii="Calibri" w:hAnsi="Calibri"/>
-                <w:b/>
-                <w:color w:val="B8966B"/>
-                <w:sz w:val="17"/>
-              </w:rPr>
-              <w:t>BASE HOTEL</w:t>
-            </w:r>
-          </w:p>
-        </w:tc>
-        <w:tc>
-          <w:tcPr>
-            <w:tcW w:type="dxa" w:w="4320"/>
-            <w:tcBorders>
-              <w:top w:val="single" w:sz="4" w:color="DDDDDD"/>
-              <w:left w:val="single" w:sz="4" w:color="DDDDDD"/>
-              <w:bottom w:val="single" w:sz="4" w:color="DDDDDD"/>
-              <w:right w:val="single" w:sz="4" w:color="DDDDDD"/>
-            </w:tcBorders>
-          </w:tcPr>
-          <w:p>
-            <w:pPr>
-              <w:spacing w:before="80" w:after="80"/>
-            </w:pPr>
-            <w:r>
-              <w:rPr>
-                <w:rFonts w:ascii="Calibri" w:hAnsi="Calibri"/>
-                <w:color w:val="1A1A1A"/>
-                <w:sz w:val="21"/>
-              </w:rPr>
-              <w:t>Hyatt Regency Cape Town</w:t>
-            </w:r>
-          </w:p>
-        </w:tc>
-      </w:tr>
-      <w:tr>
-        <w:tc>
-          <w:tcPr>
-            <w:tcW w:type="dxa" w:w="2304"/>
-            <w:tcBorders>
-              <w:top w:val="single" w:sz="4" w:color="DDDDDD"/>
-              <w:left w:val="single" w:sz="4" w:color="DDDDDD"/>
-              <w:bottom w:val="single" w:sz="4" w:color="DDDDDD"/>
-              <w:right w:val="single" w:sz="4" w:color="DDDDDD"/>
-            </w:tcBorders>
-          </w:tcPr>
-          <w:p>
-            <w:pPr>
-              <w:spacing w:before="80" w:after="80"/>
-            </w:pPr>
-            <w:r>
-              <w:rPr>
-                <w:rFonts w:ascii="Calibri" w:hAnsi="Calibri"/>
-                <w:b/>
-                <w:color w:val="B8966B"/>
-                <w:sz w:val="17"/>
-              </w:rPr>
-              <w:t>CRICKET</w:t>
-            </w:r>
-          </w:p>
-        </w:tc>
-        <w:tc>
-          <w:tcPr>
-            <w:tcW w:type="dxa" w:w="4320"/>
-            <w:tcBorders>
-              <w:top w:val="single" w:sz="4" w:color="DDDDDD"/>
-              <w:left w:val="single" w:sz="4" w:color="DDDDDD"/>
-              <w:bottom w:val="single" w:sz="4" w:color="DDDDDD"/>
-              <w:right w:val="single" w:sz="4" w:color="DDDDDD"/>
-            </w:tcBorders>
-          </w:tcPr>
-          <w:p>
-            <w:pPr>
-              <w:spacing w:before="80" w:after="80"/>
-            </w:pPr>
-            <w:r>
-              <w:rPr>
-                <w:rFonts w:ascii="Calibri" w:hAnsi="Calibri"/>
-                <w:color w:val="1A1A1A"/>
-                <w:sz w:val="21"/>
-              </w:rPr>
-              <w:t>Newlands VIP Suite — all five Test days</w:t>
-            </w:r>
-          </w:p>
-        </w:tc>
-      </w:tr>
-      <w:tr>
-        <w:tc>
-          <w:tcPr>
-            <w:tcW w:type="dxa" w:w="2304"/>
-            <w:tcBorders>
-              <w:top w:val="single" w:sz="4" w:color="DDDDDD"/>
-              <w:left w:val="single" w:sz="4" w:color="DDDDDD"/>
-              <w:bottom w:val="single" w:sz="4" w:color="DDDDDD"/>
-              <w:right w:val="single" w:sz="4" w:color="DDDDDD"/>
-            </w:tcBorders>
-          </w:tcPr>
-          <w:p>
-            <w:pPr>
-              <w:spacing w:before="80" w:after="80"/>
-            </w:pPr>
-            <w:r>
-              <w:rPr>
-                <w:rFonts w:ascii="Calibri" w:hAnsi="Calibri"/>
-                <w:b/>
-                <w:color w:val="B8966B"/>
-                <w:sz w:val="17"/>
-              </w:rPr>
-              <w:t>AVAILABILITY</w:t>
-            </w:r>
-          </w:p>
-        </w:tc>
-        <w:tc>
-          <w:tcPr>
-            <w:tcW w:type="dxa" w:w="4320"/>
-            <w:tcBorders>
-              <w:top w:val="single" w:sz="4" w:color="DDDDDD"/>
-              <w:left w:val="single" w:sz="4" w:color="DDDDDD"/>
-              <w:bottom w:val="single" w:sz="4" w:color="DDDDDD"/>
-              <w:right w:val="single" w:sz="4" w:color="DDDDDD"/>
-            </w:tcBorders>
-          </w:tcPr>
-          <w:p>
-            <w:pPr>
-              <w:spacing w:before="80" w:after="80"/>
-            </w:pPr>
-            <w:r>
-              <w:rPr>
-                <w:rFonts w:ascii="Calibri" w:hAnsi="Calibri"/>
-                <w:color w:val="1A1A1A"/>
-                <w:sz w:val="21"/>
-              </w:rPr>
-              <w:t>Limited — inquiry required</w:t>
-            </w:r>
-          </w:p>
-        </w:tc>
-      </w:tr>
-    </w:tbl>
-    <w:p/>
-    <w:p>
-      <w:pPr>
-        <w:spacing w:before="160" w:after="80"/>
-      </w:pPr>
-      <w:r>
-        <w:rPr>
-          <w:rFonts w:ascii="Garamond" w:hAnsi="Garamond"/>
-          <w:b/>
-          <w:color w:val="1B4332"/>
-          <w:sz w:val="32"/>
-        </w:rPr>
-        <w:t>From $6,950 per guest, all-inclusive ex-flights.</w:t>
+        <w:t>Base hotel throughout is the Hyatt Regency Cape Town — central, well-positioned, and exactly what it needs to be.</w:t>
       </w:r>
     </w:p>
     <w:p>
       <w:pPr>
-        <w:spacing w:before="0" w:after="80"/>
+        <w:spacing w:before="80" w:after="80"/>
+        <w:jc w:val="left"/>
       </w:pPr>
       <w:r>
         <w:rPr>
-          <w:rFonts w:ascii="Calibri" w:hAnsi="Calibri"/>
-          <w:i/>
-          <w:color w:val="6B6B6B"/>
-          <w:sz w:val="18"/>
+          <w:b/>
+          <w:i w:val="0"/>
+          <w:color w:val="1A1A1A"/>
+          <w:sz w:val="22"/>
         </w:rPr>
-        <w:t>[ZAR equivalent: TBC — confirm FX peg with Colin before sending]</w:t>
+        <w:t>Your own 24-guest private VIP suite inside the Members Pavilion — full hospitality, prime sightlines, and the only entrance Newlands locals ever envy.</w:t>
       </w:r>
     </w:p>
     <w:p>
       <w:pPr>
-        <w:spacing w:before="80" w:after="40"/>
+        <w:spacing w:before="120" w:after="40"/>
+        <w:jc w:val="left"/>
+      </w:pPr>
+    </w:p>
+    <w:p>
+      <w:pPr>
+        <w:spacing w:after="60"/>
       </w:pPr>
       <w:r>
         <w:rPr>
-          <w:rFonts w:ascii="Calibri" w:hAnsi="Calibri"/>
           <w:b/>
+          <w:color w:val="B8966B"/>
+          <w:sz w:val="20"/>
+        </w:rPr>
+        <w:t xml:space="preserve">Package:  </w:t>
+      </w:r>
+      <w:r>
+        <w:rPr>
           <w:color w:val="1A1A1A"/>
-          <w:sz w:val="21"/>
+          <w:sz w:val="22"/>
         </w:rPr>
-        <w:t>Suite capped at 24 guests — once it's full, it's full.</w:t>
+        <w:t>England vs South Africa — Third Test</w:t>
       </w:r>
     </w:p>
     <w:p>
       <w:pPr>
-        <w:spacing w:before="40" w:after="280"/>
+        <w:spacing w:after="60"/>
       </w:pPr>
       <w:r>
         <w:rPr>
-          <w:rFonts w:ascii="Calibri" w:hAnsi="Calibri"/>
           <w:b/>
           <w:color w:val="B8966B"/>
+          <w:sz w:val="20"/>
+        </w:rPr>
+        <w:t xml:space="preserve">Dates:  </w:t>
+      </w:r>
+      <w:r>
+        <w:rPr>
+          <w:color w:val="1A1A1A"/>
           <w:sz w:val="22"/>
         </w:rPr>
-        <w:t>→  Reserve Your Spot</w:t>
+        <w:t>29 December 2026 – 7 January 2027</w:t>
       </w:r>
     </w:p>
     <w:p>
       <w:pPr>
-        <w:spacing w:before="120" w:after="120"/>
+        <w:spacing w:after="60"/>
+      </w:pPr>
+      <w:r>
+        <w:rPr>
+          <w:b/>
+          <w:color w:val="B8966B"/>
+          <w:sz w:val="20"/>
+        </w:rPr>
+        <w:t xml:space="preserve">Duration:  </w:t>
+      </w:r>
+      <w:r>
+        <w:rPr>
+          <w:color w:val="1A1A1A"/>
+          <w:sz w:val="22"/>
+        </w:rPr>
+        <w:t>10 nights</w:t>
+      </w:r>
+    </w:p>
+    <w:p>
+      <w:pPr>
+        <w:spacing w:after="60"/>
+      </w:pPr>
+      <w:r>
+        <w:rPr>
+          <w:b/>
+          <w:color w:val="B8966B"/>
+          <w:sz w:val="20"/>
+        </w:rPr>
+        <w:t xml:space="preserve">Base Hotel:  </w:t>
+      </w:r>
+      <w:r>
+        <w:rPr>
+          <w:color w:val="1A1A1A"/>
+          <w:sz w:val="22"/>
+        </w:rPr>
+        <w:t>Hyatt Regency Cape Town</w:t>
+      </w:r>
+    </w:p>
+    <w:p>
+      <w:pPr>
+        <w:spacing w:after="60"/>
+      </w:pPr>
+      <w:r>
+        <w:rPr>
+          <w:b/>
+          <w:color w:val="B8966B"/>
+          <w:sz w:val="20"/>
+        </w:rPr>
+        <w:t xml:space="preserve">Cricket:  </w:t>
+      </w:r>
+      <w:r>
+        <w:rPr>
+          <w:color w:val="1A1A1A"/>
+          <w:sz w:val="22"/>
+        </w:rPr>
+        <w:t>Newlands VIP Suite — all five Test days</w:t>
+      </w:r>
+    </w:p>
+    <w:p>
+      <w:pPr>
+        <w:spacing w:after="60"/>
+      </w:pPr>
+      <w:r>
+        <w:rPr>
+          <w:b/>
+          <w:color w:val="B8966B"/>
+          <w:sz w:val="20"/>
+        </w:rPr>
+        <w:t xml:space="preserve">Availability:  </w:t>
+      </w:r>
+      <w:r>
+        <w:rPr>
+          <w:color w:val="1A1A1A"/>
+          <w:sz w:val="22"/>
+        </w:rPr>
+        <w:t>Limited — suite capped at 24 guests</w:t>
+      </w:r>
+    </w:p>
+    <w:p>
+      <w:pPr>
+        <w:spacing w:before="120" w:after="80"/>
+        <w:jc w:val="left"/>
+      </w:pPr>
+    </w:p>
+    <w:p>
+      <w:pPr>
+        <w:spacing w:before="40" w:after="40"/>
+        <w:jc w:val="left"/>
+      </w:pPr>
+      <w:r>
+        <w:rPr>
+          <w:b/>
+          <w:i w:val="0"/>
+          <w:color w:val="B8966B"/>
+          <w:sz w:val="22"/>
+        </w:rPr>
+        <w:t>►  Reserve Your Spot — hello@eventragroup.co.za</w:t>
+      </w:r>
+    </w:p>
+    <w:p>
+      <w:pPr>
+        <w:spacing w:before="0" w:after="280"/>
+        <w:jc w:val="left"/>
+      </w:pPr>
+      <w:r>
+        <w:rPr>
+          <w:b w:val="0"/>
+          <w:i/>
+          <w:color w:val="6B6B6B"/>
+          <w:sz w:val="20"/>
+        </w:rPr>
+        <w:t>Suite capped at 24 guests — once it’s full, it’s full.</w:t>
+      </w:r>
+    </w:p>
+    <w:p>
+      <w:pPr>
+        <w:spacing w:before="320" w:after="120"/>
+        <w:jc w:val="left"/>
+      </w:pPr>
+      <w:r>
+        <w:rPr>
+          <w:b/>
+          <w:color w:val="1A1A1A"/>
+          <w:sz w:val="36"/>
+        </w:rPr>
+        <w:t>The Program</w:t>
+      </w:r>
+    </w:p>
+    <w:p>
+      <w:pPr>
+        <w:spacing w:before="160" w:after="160"/>
         <w:pBdr>
-          <w:bottom w:val="single" w:sz="6" w:space="1" w:color="B8966B"/>
+          <w:bottom w:val="single" w:sz="4" w:space="1" w:color="B8966B"/>
         </w:pBdr>
       </w:pPr>
     </w:p>
     <w:p>
       <w:pPr>
-        <w:spacing w:before="200" w:after="80"/>
+        <w:spacing w:before="200" w:after="40"/>
       </w:pPr>
       <w:r>
         <w:rPr>
-          <w:rFonts w:ascii="Calibri" w:hAnsi="Calibri"/>
           <w:b/>
-          <w:i w:val="0"/>
           <w:color w:val="B8966B"/>
-          <w:sz w:val="17"/>
+          <w:sz w:val="20"/>
         </w:rPr>
-        <w:t>DAY BY DAY</w:t>
+        <w:t xml:space="preserve">Day 1  —  </w:t>
+      </w:r>
+      <w:r>
+        <w:rPr>
+          <w:b/>
+          <w:color w:val="1A1A1A"/>
+          <w:sz w:val="26"/>
+        </w:rPr>
+        <w:t>Arrival</w:t>
       </w:r>
     </w:p>
     <w:p>
       <w:pPr>
-        <w:spacing w:before="80" w:after="320"/>
+        <w:spacing w:before="40" w:after="120"/>
         <w:jc w:val="left"/>
       </w:pPr>
       <w:r>
         <w:rPr>
-          <w:rFonts w:ascii="Garamond" w:hAnsi="Garamond"/>
           <w:b w:val="0"/>
           <w:i w:val="0"/>
-          <w:color w:val="1B4332"/>
-          <w:sz w:val="48"/>
+          <w:color w:val="1A1A1A"/>
+          <w:sz w:val="22"/>
         </w:rPr>
-        <w:t>The Program</w:t>
+        <w:t>Private transfer from Cape Town International to the Hyatt Regency. The city is there before you’ve unpacked. That evening: a reserved welcome dinner at a Cape Town venue chosen for the table, not the reputation — your first taste of a city that rewards those who know where to sit.</w:t>
       </w:r>
     </w:p>
     <w:p>
@@ -630,41 +445,34 @@
       </w:pPr>
       <w:r>
         <w:rPr>
-          <w:rFonts w:ascii="Calibri" w:hAnsi="Calibri"/>
           <w:b/>
           <w:color w:val="B8966B"/>
-          <w:sz w:val="16"/>
+          <w:sz w:val="20"/>
         </w:rPr>
-        <w:t>DAY 1</w:t>
+        <w:t xml:space="preserve">Day 2  —  </w:t>
+      </w:r>
+      <w:r>
+        <w:rPr>
+          <w:b/>
+          <w:color w:val="1A1A1A"/>
+          <w:sz w:val="26"/>
+        </w:rPr>
+        <w:t>The Winelands</w:t>
       </w:r>
     </w:p>
     <w:p>
       <w:pPr>
-        <w:spacing w:before="0" w:after="80"/>
-      </w:pPr>
-      <w:r>
-        <w:rPr>
-          <w:rFonts w:ascii="Garamond" w:hAnsi="Garamond"/>
-          <w:b w:val="0"/>
-          <w:color w:val="1A1A1A"/>
-          <w:sz w:val="32"/>
-        </w:rPr>
-        <w:t>Arrival</w:t>
-      </w:r>
-    </w:p>
-    <w:p>
-      <w:pPr>
-        <w:spacing w:before="0" w:after="120"/>
+        <w:spacing w:before="40" w:after="120"/>
         <w:jc w:val="left"/>
       </w:pPr>
       <w:r>
         <w:rPr>
-          <w:rFonts w:ascii="Calibri" w:hAnsi="Calibri"/>
+          <w:b w:val="0"/>
           <w:i w:val="0"/>
-          <w:color w:val="6B6B6B"/>
+          <w:color w:val="1A1A1A"/>
           <w:sz w:val="22"/>
         </w:rPr>
-        <w:t>Private transfer from Cape Town International to the Hyatt Regency — no queues, no logistics, just Cape Town through the window. Your first evening: a welcome dinner at a Cape Town restaurant chosen for the table, not the name. The food is the point. The city starts here.</w:t>
+        <w:t>Private access to Anthonij Rupert Estate in Franschhoek, one of South Africa’s most exclusive wine properties. Behind-the-scenes cellar tour and a long lunch most travelers never get to book. The Franschhoek valley in summer — all mountain and vine — is the kind of afternoon you’ll remember as cooler than it was.</w:t>
       </w:r>
     </w:p>
     <w:p>
@@ -673,41 +481,34 @@
       </w:pPr>
       <w:r>
         <w:rPr>
-          <w:rFonts w:ascii="Calibri" w:hAnsi="Calibri"/>
           <w:b/>
           <w:color w:val="B8966B"/>
-          <w:sz w:val="16"/>
+          <w:sz w:val="20"/>
         </w:rPr>
-        <w:t>DAY 2</w:t>
+        <w:t xml:space="preserve">Day 3  —  </w:t>
+      </w:r>
+      <w:r>
+        <w:rPr>
+          <w:b/>
+          <w:color w:val="1A1A1A"/>
+          <w:sz w:val="26"/>
+        </w:rPr>
+        <w:t>Chapman’s Peak and Cape Point — New Year’s Eve</w:t>
       </w:r>
     </w:p>
     <w:p>
       <w:pPr>
-        <w:spacing w:before="0" w:after="80"/>
-      </w:pPr>
-      <w:r>
-        <w:rPr>
-          <w:rFonts w:ascii="Garamond" w:hAnsi="Garamond"/>
-          <w:b w:val="0"/>
-          <w:color w:val="1A1A1A"/>
-          <w:sz w:val="32"/>
-        </w:rPr>
-        <w:t>The Winelands</w:t>
-      </w:r>
-    </w:p>
-    <w:p>
-      <w:pPr>
-        <w:spacing w:before="0" w:after="120"/>
+        <w:spacing w:before="40" w:after="120"/>
         <w:jc w:val="left"/>
       </w:pPr>
       <w:r>
         <w:rPr>
-          <w:rFonts w:ascii="Calibri" w:hAnsi="Calibri"/>
+          <w:b w:val="0"/>
           <w:i w:val="0"/>
-          <w:color w:val="6B6B6B"/>
+          <w:color w:val="1A1A1A"/>
           <w:sz w:val="22"/>
         </w:rPr>
-        <w:t>Private access to Anthonij Rupert, one of South Africa's most exclusive wine estates. Behind-the-scenes cellar tour and a long lunch most travelers never get to book. Franschhoek in summer: the vines are full, the terrace is warm, and there's no reason to hurry.</w:t>
+        <w:t>Exclusive drive along one of the world’s great coastal roads — Chapman’s Peak, winding along the Atlantic cliff face toward the Cape of Good Hope. You’ll see the ocean from a road carved into the mountain itself. That evening: a reserved rooftop New Year’s Eve dinner over the city lights, seated before midnight finds you.</w:t>
       </w:r>
     </w:p>
     <w:p>
@@ -716,41 +517,34 @@
       </w:pPr>
       <w:r>
         <w:rPr>
-          <w:rFonts w:ascii="Calibri" w:hAnsi="Calibri"/>
           <w:b/>
           <w:color w:val="B8966B"/>
-          <w:sz w:val="16"/>
+          <w:sz w:val="20"/>
         </w:rPr>
-        <w:t>DAY 3</w:t>
+        <w:t xml:space="preserve">Day 4  —  </w:t>
+      </w:r>
+      <w:r>
+        <w:rPr>
+          <w:b/>
+          <w:color w:val="1A1A1A"/>
+          <w:sz w:val="26"/>
+        </w:rPr>
+        <w:t>Your Day, Your Way</w:t>
       </w:r>
     </w:p>
     <w:p>
       <w:pPr>
-        <w:spacing w:before="0" w:after="80"/>
-      </w:pPr>
-      <w:r>
-        <w:rPr>
-          <w:rFonts w:ascii="Garamond" w:hAnsi="Garamond"/>
-          <w:b w:val="0"/>
-          <w:color w:val="1A1A1A"/>
-          <w:sz w:val="32"/>
-        </w:rPr>
-        <w:t>Chapman's Peak &amp; Cape Point — New Year's Eve</w:t>
-      </w:r>
-    </w:p>
-    <w:p>
-      <w:pPr>
-        <w:spacing w:before="0" w:after="120"/>
+        <w:spacing w:before="40" w:after="120"/>
         <w:jc w:val="left"/>
       </w:pPr>
       <w:r>
         <w:rPr>
-          <w:rFonts w:ascii="Calibri" w:hAnsi="Calibri"/>
+          <w:b w:val="0"/>
           <w:i w:val="0"/>
-          <w:color w:val="6B6B6B"/>
+          <w:color w:val="1A1A1A"/>
           <w:sz w:val="22"/>
         </w:rPr>
-        <w:t>The day begins on one of the world's great coastal drives. Chapman's Peak winds along the Atlantic cliff face toward the Cape of Good Hope — you'll see the ocean on both sides of the peninsula. That evening: a reserved rooftop table for New Year's Eve dinner over the city. Midnight finds you exactly where you'd want to be.</w:t>
+        <w:t>New Year’s Day. No schedule. Recharge poolside at the Hyatt, or add optional upgrades: shark cage diving off the Cape Peninsula, a Robben Island tour, or a private yacht charter around the V&amp;A Waterfront. The city is yours.</w:t>
       </w:r>
     </w:p>
     <w:p>
@@ -759,41 +553,34 @@
       </w:pPr>
       <w:r>
         <w:rPr>
-          <w:rFonts w:ascii="Calibri" w:hAnsi="Calibri"/>
           <w:b/>
           <w:color w:val="B8966B"/>
-          <w:sz w:val="16"/>
+          <w:sz w:val="20"/>
         </w:rPr>
-        <w:t>DAY 4</w:t>
+        <w:t xml:space="preserve">Day 5  —  </w:t>
+      </w:r>
+      <w:r>
+        <w:rPr>
+          <w:b/>
+          <w:color w:val="1A1A1A"/>
+          <w:sz w:val="26"/>
+        </w:rPr>
+        <w:t>Table Mountain and Bo-Kaap</w:t>
       </w:r>
     </w:p>
     <w:p>
       <w:pPr>
-        <w:spacing w:before="0" w:after="80"/>
-      </w:pPr>
-      <w:r>
-        <w:rPr>
-          <w:rFonts w:ascii="Garamond" w:hAnsi="Garamond"/>
-          <w:b w:val="0"/>
-          <w:color w:val="1A1A1A"/>
-          <w:sz w:val="32"/>
-        </w:rPr>
-        <w:t>Your Day, Your Way — New Year's Day</w:t>
-      </w:r>
-    </w:p>
-    <w:p>
-      <w:pPr>
-        <w:spacing w:before="0" w:after="120"/>
+        <w:spacing w:before="40" w:after="120"/>
         <w:jc w:val="left"/>
       </w:pPr>
       <w:r>
         <w:rPr>
-          <w:rFonts w:ascii="Calibri" w:hAnsi="Calibri"/>
+          <w:b w:val="0"/>
           <w:i w:val="0"/>
-          <w:color w:val="6B6B6B"/>
+          <w:color w:val="1A1A1A"/>
           <w:sz w:val="22"/>
         </w:rPr>
-        <w:t>No fixed schedule. Recharge poolside at the Hyatt, or upgrade to optional add-ons: shark cage diving, a Robben Island tour, or a private yacht charter around the V&amp;A Waterfront. The day is yours.</w:t>
+        <w:t>VIP morning ascent of Table Mountain — one of the few natural landmarks that justifies every photograph ever taken of it. You’ll stand at 3,500 feet with the Atlantic on both sides and the city laid out below. The afternoon moves through the Bo-Kaap, Cape Town’s oldest residential quarter, with its painted houses and its unhurried pace.</w:t>
       </w:r>
     </w:p>
     <w:p>
@@ -802,41 +589,34 @@
       </w:pPr>
       <w:r>
         <w:rPr>
-          <w:rFonts w:ascii="Calibri" w:hAnsi="Calibri"/>
           <w:b/>
           <w:color w:val="B8966B"/>
-          <w:sz w:val="16"/>
+          <w:sz w:val="20"/>
         </w:rPr>
-        <w:t>DAY 5</w:t>
+        <w:t xml:space="preserve">Days 6–10  —  </w:t>
+      </w:r>
+      <w:r>
+        <w:rPr>
+          <w:b/>
+          <w:color w:val="1A1A1A"/>
+          <w:sz w:val="26"/>
+        </w:rPr>
+        <w:t>The Third Test, Newlands</w:t>
       </w:r>
     </w:p>
     <w:p>
       <w:pPr>
-        <w:spacing w:before="0" w:after="80"/>
-      </w:pPr>
-      <w:r>
-        <w:rPr>
-          <w:rFonts w:ascii="Garamond" w:hAnsi="Garamond"/>
-          <w:b w:val="0"/>
-          <w:color w:val="1A1A1A"/>
-          <w:sz w:val="32"/>
-        </w:rPr>
-        <w:t>Table Mountain &amp; Bo-Kaap</w:t>
-      </w:r>
-    </w:p>
-    <w:p>
-      <w:pPr>
-        <w:spacing w:before="0" w:after="120"/>
+        <w:spacing w:before="40" w:after="120"/>
         <w:jc w:val="left"/>
       </w:pPr>
       <w:r>
         <w:rPr>
-          <w:rFonts w:ascii="Calibri" w:hAnsi="Calibri"/>
+          <w:b w:val="0"/>
           <w:i w:val="0"/>
-          <w:color w:val="6B6B6B"/>
+          <w:color w:val="1A1A1A"/>
           <w:sz w:val="22"/>
         </w:rPr>
-        <w:t>Exclusive morning ascent of Table Mountain — one of the few natural landmarks that earns every photograph taken of it. You'll see the full Cape Peninsula from the top: both coastlines, the city below, the winelands behind. The afternoon moves through the Bo-Kaap, Cape Town's oldest residential quarter, with its painted houses and unhurried rhythm.</w:t>
+        <w:t>Five days of Test cricket at one of world sport’s most distinctive venues — the mountain behind the stand, the late summer light, the atmosphere that Newlands has held for over a century. You’ll watch it from your private VIP suite in the Members Pavilion: 24 guests, curated hospitality, prime sightlines, and the only entrance Newlands locals ever envy. Evenings include exclusive dinner at Sevruga, the Atlantic Seaboard’s long-standing seafood institution, and Grand Beach Café in Camps Bay.</w:t>
       </w:r>
     </w:p>
     <w:p>
@@ -845,147 +625,131 @@
       </w:pPr>
       <w:r>
         <w:rPr>
-          <w:rFonts w:ascii="Calibri" w:hAnsi="Calibri"/>
           <w:b/>
           <w:color w:val="B8966B"/>
-          <w:sz w:val="16"/>
+          <w:sz w:val="20"/>
         </w:rPr>
-        <w:t>DAYS 6–10</w:t>
+        <w:t xml:space="preserve">Day 10  —  </w:t>
       </w:r>
-    </w:p>
-    <w:p>
-      <w:pPr>
-        <w:spacing w:before="0" w:after="80"/>
-      </w:pPr>
       <w:r>
         <w:rPr>
-          <w:rFonts w:ascii="Garamond" w:hAnsi="Garamond"/>
-          <w:b w:val="0"/>
+          <w:b/>
           <w:color w:val="1A1A1A"/>
-          <w:sz w:val="32"/>
-        </w:rPr>
-        <w:t>The Third Test, Newlands</w:t>
-      </w:r>
-    </w:p>
-    <w:p>
-      <w:pPr>
-        <w:spacing w:before="0" w:after="120"/>
-        <w:jc w:val="left"/>
-      </w:pPr>
-      <w:r>
-        <w:rPr>
-          <w:rFonts w:ascii="Calibri" w:hAnsi="Calibri"/>
-          <w:i w:val="0"/>
-          <w:color w:val="6B6B6B"/>
-          <w:sz w:val="22"/>
-        </w:rPr>
-        <w:t>Five days of Test cricket at one of world sport's most distinctive venues. The mountain sits directly behind the stand. The late summer light falls across the outfield in a way that makes even the pauses feel like part of the event. Your VIP suite gives you everything you need: curated hospitality, reserved seating with prime sightlines, and the freedom to watch it properly. Evenings include dinner at Sevruga — the Atlantic Seaboard's long-standing seafood institution — and Grand Beach Café in Camps Bay, with the ocean directly in front of you.</w:t>
-      </w:r>
-    </w:p>
-    <w:p>
-      <w:pPr>
-        <w:spacing w:before="200" w:after="40"/>
-      </w:pPr>
-      <w:r>
-        <w:rPr>
-          <w:rFonts w:ascii="Calibri" w:hAnsi="Calibri"/>
-          <w:b/>
-          <w:color w:val="B8966B"/>
-          <w:sz w:val="16"/>
-        </w:rPr>
-        <w:t>DAY 10</w:t>
-      </w:r>
-    </w:p>
-    <w:p>
-      <w:pPr>
-        <w:spacing w:before="0" w:after="80"/>
-      </w:pPr>
-      <w:r>
-        <w:rPr>
-          <w:rFonts w:ascii="Garamond" w:hAnsi="Garamond"/>
-          <w:b w:val="0"/>
-          <w:color w:val="1A1A1A"/>
-          <w:sz w:val="32"/>
+          <w:sz w:val="26"/>
         </w:rPr>
         <w:t>Departure</w:t>
       </w:r>
     </w:p>
     <w:p>
       <w:pPr>
-        <w:spacing w:before="0" w:after="120"/>
+        <w:spacing w:before="40" w:after="120"/>
         <w:jc w:val="left"/>
       </w:pPr>
       <w:r>
         <w:rPr>
-          <w:rFonts w:ascii="Calibri" w:hAnsi="Calibri"/>
+          <w:b w:val="0"/>
           <w:i w:val="0"/>
-          <w:color w:val="6B6B6B"/>
+          <w:color w:val="1A1A1A"/>
           <w:sz w:val="22"/>
         </w:rPr>
-        <w:t>A final lunch in the city before your private transfer to the airport. The right way to leave.</w:t>
+        <w:t>A final lunch in the city before your reserved private transfer to the airport. The right way to leave.</w:t>
       </w:r>
     </w:p>
     <w:p>
       <w:pPr>
-        <w:spacing w:before="160" w:after="80"/>
+        <w:spacing w:before="80" w:after="80"/>
+        <w:jc w:val="left"/>
+      </w:pPr>
+    </w:p>
+    <w:p>
+      <w:pPr>
+        <w:spacing w:before="40" w:after="40"/>
+        <w:jc w:val="left"/>
       </w:pPr>
       <w:r>
         <w:rPr>
-          <w:rFonts w:ascii="Calibri" w:hAnsi="Calibri"/>
           <w:b/>
+          <w:i w:val="0"/>
           <w:color w:val="B8966B"/>
-          <w:sz w:val="21"/>
+          <w:sz w:val="22"/>
         </w:rPr>
-        <w:t>Suite capped at 24 guests — once it's full, it's full.   →  Reserve Your Spot</w:t>
+        <w:t>►  Reserve Your Spot — hello@eventragroup.co.za</w:t>
       </w:r>
     </w:p>
     <w:p>
       <w:pPr>
-        <w:spacing w:before="120" w:after="120"/>
+        <w:spacing w:before="0" w:after="280"/>
+        <w:jc w:val="left"/>
+      </w:pPr>
+      <w:r>
+        <w:rPr>
+          <w:b w:val="0"/>
+          <w:i/>
+          <w:color w:val="6B6B6B"/>
+          <w:sz w:val="20"/>
+        </w:rPr>
+        <w:t>Suite capped at 24 guests — once it’s full, it’s full.</w:t>
+      </w:r>
+    </w:p>
+    <w:p>
+      <w:pPr>
+        <w:spacing w:before="320" w:after="120"/>
+        <w:jc w:val="left"/>
+      </w:pPr>
+      <w:r>
+        <w:rPr>
+          <w:b/>
+          <w:color w:val="1A1A1A"/>
+          <w:sz w:val="36"/>
+        </w:rPr>
+        <w:t>What Is Included</w:t>
+      </w:r>
+    </w:p>
+    <w:p>
+      <w:pPr>
+        <w:spacing w:before="160" w:after="160"/>
         <w:pBdr>
-          <w:bottom w:val="single" w:sz="6" w:space="1" w:color="B8966B"/>
+          <w:bottom w:val="single" w:sz="4" w:space="1" w:color="B8966B"/>
         </w:pBdr>
       </w:pPr>
     </w:p>
     <w:p>
       <w:pPr>
-        <w:spacing w:before="200" w:after="80"/>
+        <w:spacing w:before="160" w:after="120"/>
+        <w:jc w:val="left"/>
       </w:pPr>
       <w:r>
         <w:rPr>
-          <w:rFonts w:ascii="Calibri" w:hAnsi="Calibri"/>
           <w:b/>
           <w:i w:val="0"/>
-          <w:color w:val="B8966B"/>
-          <w:sz w:val="17"/>
+          <w:color w:val="1A1A1A"/>
+          <w:sz w:val="26"/>
         </w:rPr>
-        <w:t>WHAT'S INCLUDED</w:t>
+        <w:t>Every detail. Handled.</w:t>
       </w:r>
     </w:p>
     <w:p>
       <w:pPr>
-        <w:spacing w:before="80" w:after="160"/>
+        <w:spacing w:before="0" w:after="200"/>
         <w:jc w:val="left"/>
       </w:pPr>
       <w:r>
         <w:rPr>
-          <w:rFonts w:ascii="Garamond" w:hAnsi="Garamond"/>
           <w:b w:val="0"/>
-          <w:i w:val="0"/>
-          <w:color w:val="1B4332"/>
-          <w:sz w:val="44"/>
+          <w:i/>
+          <w:color w:val="6B6B6B"/>
+          <w:sz w:val="22"/>
         </w:rPr>
-        <w:t>Every Detail. Handled.</w:t>
+        <w:t>Everything required. Nothing extraneous.</w:t>
       </w:r>
     </w:p>
     <w:p>
       <w:pPr>
         <w:pStyle w:val="ListBullet"/>
-        <w:spacing w:before="40" w:after="40"/>
+        <w:spacing w:after="60"/>
       </w:pPr>
       <w:r>
         <w:rPr>
-          <w:rFonts w:ascii="Calibri" w:hAnsi="Calibri"/>
           <w:color w:val="1A1A1A"/>
           <w:sz w:val="22"/>
         </w:rPr>
@@ -995,11 +759,10 @@
     <w:p>
       <w:pPr>
         <w:pStyle w:val="ListBullet"/>
-        <w:spacing w:before="40" w:after="40"/>
+        <w:spacing w:after="60"/>
       </w:pPr>
       <w:r>
         <w:rPr>
-          <w:rFonts w:ascii="Calibri" w:hAnsi="Calibri"/>
           <w:color w:val="1A1A1A"/>
           <w:sz w:val="22"/>
         </w:rPr>
@@ -1009,53 +772,49 @@
     <w:p>
       <w:pPr>
         <w:pStyle w:val="ListBullet"/>
-        <w:spacing w:before="40" w:after="40"/>
+        <w:spacing w:after="60"/>
       </w:pPr>
       <w:r>
         <w:rPr>
-          <w:rFonts w:ascii="Calibri" w:hAnsi="Calibri"/>
           <w:color w:val="1A1A1A"/>
           <w:sz w:val="22"/>
         </w:rPr>
-        <w:t>Full-day guided excursion to Anthonij Rupert Estate, Franschhoek — private tasting and lunch included</w:t>
+        <w:t>Full-day exclusive excursion to Anthonij Rupert Estate, Franschhoek — private tasting and lunch included</w:t>
       </w:r>
     </w:p>
     <w:p>
       <w:pPr>
         <w:pStyle w:val="ListBullet"/>
-        <w:spacing w:before="40" w:after="40"/>
+        <w:spacing w:after="60"/>
       </w:pPr>
       <w:r>
         <w:rPr>
-          <w:rFonts w:ascii="Calibri" w:hAnsi="Calibri"/>
           <w:color w:val="1A1A1A"/>
           <w:sz w:val="22"/>
         </w:rPr>
-        <w:t>Chapman's Peak coastal drive and Cape of Good Hope visit</w:t>
+        <w:t>Chapman’s Peak coastal drive and Cape of Good Hope visit</w:t>
       </w:r>
     </w:p>
     <w:p>
       <w:pPr>
         <w:pStyle w:val="ListBullet"/>
-        <w:spacing w:before="40" w:after="40"/>
+        <w:spacing w:after="60"/>
       </w:pPr>
       <w:r>
         <w:rPr>
-          <w:rFonts w:ascii="Calibri" w:hAnsi="Calibri"/>
           <w:color w:val="1A1A1A"/>
           <w:sz w:val="22"/>
         </w:rPr>
-        <w:t>New Year's Eve rooftop dinner</w:t>
+        <w:t>New Year’s Eve rooftop dinner</w:t>
       </w:r>
     </w:p>
     <w:p>
       <w:pPr>
         <w:pStyle w:val="ListBullet"/>
-        <w:spacing w:before="40" w:after="40"/>
+        <w:spacing w:after="60"/>
       </w:pPr>
       <w:r>
         <w:rPr>
-          <w:rFonts w:ascii="Calibri" w:hAnsi="Calibri"/>
           <w:color w:val="1A1A1A"/>
           <w:sz w:val="22"/>
         </w:rPr>
@@ -1065,11 +824,10 @@
     <w:p>
       <w:pPr>
         <w:pStyle w:val="ListBullet"/>
-        <w:spacing w:before="40" w:after="40"/>
+        <w:spacing w:after="60"/>
       </w:pPr>
       <w:r>
         <w:rPr>
-          <w:rFonts w:ascii="Calibri" w:hAnsi="Calibri"/>
           <w:color w:val="1A1A1A"/>
           <w:sz w:val="22"/>
         </w:rPr>
@@ -1079,11 +837,10 @@
     <w:p>
       <w:pPr>
         <w:pStyle w:val="ListBullet"/>
-        <w:spacing w:before="40" w:after="40"/>
+        <w:spacing w:after="60"/>
       </w:pPr>
       <w:r>
         <w:rPr>
-          <w:rFonts w:ascii="Calibri" w:hAnsi="Calibri"/>
           <w:color w:val="1A1A1A"/>
           <w:sz w:val="22"/>
         </w:rPr>
@@ -1093,11 +850,10 @@
     <w:p>
       <w:pPr>
         <w:pStyle w:val="ListBullet"/>
-        <w:spacing w:before="40" w:after="40"/>
+        <w:spacing w:after="60"/>
       </w:pPr>
       <w:r>
         <w:rPr>
-          <w:rFonts w:ascii="Calibri" w:hAnsi="Calibri"/>
           <w:color w:val="1A1A1A"/>
           <w:sz w:val="22"/>
         </w:rPr>
@@ -1107,11 +863,10 @@
     <w:p>
       <w:pPr>
         <w:pStyle w:val="ListBullet"/>
-        <w:spacing w:before="40" w:after="40"/>
+        <w:spacing w:after="60"/>
       </w:pPr>
       <w:r>
         <w:rPr>
-          <w:rFonts w:ascii="Calibri" w:hAnsi="Calibri"/>
           <w:color w:val="1A1A1A"/>
           <w:sz w:val="22"/>
         </w:rPr>
@@ -1121,11 +876,10 @@
     <w:p>
       <w:pPr>
         <w:pStyle w:val="ListBullet"/>
-        <w:spacing w:before="40" w:after="40"/>
+        <w:spacing w:after="60"/>
       </w:pPr>
       <w:r>
         <w:rPr>
-          <w:rFonts w:ascii="Calibri" w:hAnsi="Calibri"/>
           <w:color w:val="1A1A1A"/>
           <w:sz w:val="22"/>
         </w:rPr>
@@ -1139,408 +893,287 @@
       </w:pPr>
       <w:r>
         <w:rPr>
-          <w:rFonts w:ascii="Calibri" w:hAnsi="Calibri"/>
+          <w:b w:val="0"/>
           <w:i/>
           <w:color w:val="6B6B6B"/>
-          <w:sz w:val="19"/>
+          <w:sz w:val="20"/>
         </w:rPr>
-        <w:t>Not included: International flights  ·  Personal expenditure  ·  Optional excursions</w:t>
+        <w:t>Not included: International flights — Personal expenditure — Optional excursions</w:t>
       </w:r>
     </w:p>
     <w:p>
       <w:pPr>
-        <w:spacing w:before="80" w:after="280"/>
+        <w:spacing w:before="40" w:after="40"/>
+        <w:jc w:val="left"/>
       </w:pPr>
       <w:r>
         <w:rPr>
-          <w:rFonts w:ascii="Calibri" w:hAnsi="Calibri"/>
           <w:b/>
+          <w:i w:val="0"/>
           <w:color w:val="B8966B"/>
-          <w:sz w:val="21"/>
+          <w:sz w:val="22"/>
         </w:rPr>
-        <w:t>Suite capped at 24 guests — once it's full, it's full.   →  Reserve Your Spot</w:t>
+        <w:t>►  Reserve Your Spot — hello@eventragroup.co.za</w:t>
       </w:r>
     </w:p>
     <w:p>
       <w:pPr>
-        <w:spacing w:before="120" w:after="120"/>
+        <w:spacing w:before="0" w:after="280"/>
+        <w:jc w:val="left"/>
+      </w:pPr>
+      <w:r>
+        <w:rPr>
+          <w:b w:val="0"/>
+          <w:i/>
+          <w:color w:val="6B6B6B"/>
+          <w:sz w:val="20"/>
+        </w:rPr>
+        <w:t>Suite capped at 24 guests — once it’s full, it’s full.</w:t>
+      </w:r>
+    </w:p>
+    <w:p>
+      <w:pPr>
+        <w:spacing w:before="320" w:after="120"/>
+        <w:jc w:val="left"/>
+      </w:pPr>
+      <w:r>
+        <w:rPr>
+          <w:b/>
+          <w:color w:val="1A1A1A"/>
+          <w:sz w:val="36"/>
+        </w:rPr>
+        <w:t>Practical Details</w:t>
+      </w:r>
+    </w:p>
+    <w:p>
+      <w:pPr>
+        <w:spacing w:before="160" w:after="160"/>
         <w:pBdr>
-          <w:bottom w:val="single" w:sz="6" w:space="1" w:color="B8966B"/>
+          <w:bottom w:val="single" w:sz="4" w:space="1" w:color="B8966B"/>
         </w:pBdr>
       </w:pPr>
     </w:p>
     <w:p>
       <w:pPr>
-        <w:spacing w:before="200" w:after="80"/>
+        <w:spacing w:before="160" w:after="200"/>
+        <w:jc w:val="left"/>
       </w:pPr>
       <w:r>
         <w:rPr>
-          <w:rFonts w:ascii="Calibri" w:hAnsi="Calibri"/>
           <w:b/>
           <w:i w:val="0"/>
-          <w:color w:val="B8966B"/>
-          <w:sz w:val="17"/>
+          <w:color w:val="1A1A1A"/>
+          <w:sz w:val="26"/>
         </w:rPr>
-        <w:t>PRACTICAL DETAILS</w:t>
+        <w:t>Everything you need to know.</w:t>
       </w:r>
     </w:p>
     <w:p>
       <w:pPr>
-        <w:spacing w:before="80" w:after="240"/>
+        <w:spacing w:after="60"/>
+      </w:pPr>
+      <w:r>
+        <w:rPr>
+          <w:b/>
+          <w:color w:val="B8966B"/>
+          <w:sz w:val="20"/>
+        </w:rPr>
+        <w:t xml:space="preserve">Event:  </w:t>
+      </w:r>
+      <w:r>
+        <w:rPr>
+          <w:color w:val="1A1A1A"/>
+          <w:sz w:val="22"/>
+        </w:rPr>
+        <w:t>England vs South Africa — Third Test</w:t>
+      </w:r>
+    </w:p>
+    <w:p>
+      <w:pPr>
+        <w:spacing w:after="60"/>
+      </w:pPr>
+      <w:r>
+        <w:rPr>
+          <w:b/>
+          <w:color w:val="B8966B"/>
+          <w:sz w:val="20"/>
+        </w:rPr>
+        <w:t xml:space="preserve">Venue:  </w:t>
+      </w:r>
+      <w:r>
+        <w:rPr>
+          <w:color w:val="1A1A1A"/>
+          <w:sz w:val="22"/>
+        </w:rPr>
+        <w:t>Newlands Cricket Ground, Cape Town</w:t>
+      </w:r>
+    </w:p>
+    <w:p>
+      <w:pPr>
+        <w:spacing w:after="60"/>
+      </w:pPr>
+      <w:r>
+        <w:rPr>
+          <w:b/>
+          <w:color w:val="B8966B"/>
+          <w:sz w:val="20"/>
+        </w:rPr>
+        <w:t xml:space="preserve">Package Dates:  </w:t>
+      </w:r>
+      <w:r>
+        <w:rPr>
+          <w:color w:val="1A1A1A"/>
+          <w:sz w:val="22"/>
+        </w:rPr>
+        <w:t>29 December 2026 – 7 January 2027</w:t>
+      </w:r>
+    </w:p>
+    <w:p>
+      <w:pPr>
+        <w:spacing w:after="60"/>
+      </w:pPr>
+      <w:r>
+        <w:rPr>
+          <w:b/>
+          <w:color w:val="B8966B"/>
+          <w:sz w:val="20"/>
+        </w:rPr>
+        <w:t xml:space="preserve">Duration:  </w:t>
+      </w:r>
+      <w:r>
+        <w:rPr>
+          <w:color w:val="1A1A1A"/>
+          <w:sz w:val="22"/>
+        </w:rPr>
+        <w:t>10 nights</w:t>
+      </w:r>
+    </w:p>
+    <w:p>
+      <w:pPr>
+        <w:spacing w:after="60"/>
+      </w:pPr>
+      <w:r>
+        <w:rPr>
+          <w:b/>
+          <w:color w:val="B8966B"/>
+          <w:sz w:val="20"/>
+        </w:rPr>
+        <w:t xml:space="preserve">Base Hotel:  </w:t>
+      </w:r>
+      <w:r>
+        <w:rPr>
+          <w:color w:val="1A1A1A"/>
+          <w:sz w:val="22"/>
+        </w:rPr>
+        <w:t>Hyatt Regency Cape Town</w:t>
+      </w:r>
+    </w:p>
+    <w:p>
+      <w:pPr>
+        <w:spacing w:after="60"/>
+      </w:pPr>
+      <w:r>
+        <w:rPr>
+          <w:b/>
+          <w:color w:val="B8966B"/>
+          <w:sz w:val="20"/>
+        </w:rPr>
+        <w:t xml:space="preserve">Suite Capacity:  </w:t>
+      </w:r>
+      <w:r>
+        <w:rPr>
+          <w:color w:val="1A1A1A"/>
+          <w:sz w:val="22"/>
+        </w:rPr>
+        <w:t>24 guests — private VIP suite, Members Pavilion</w:t>
+      </w:r>
+    </w:p>
+    <w:p>
+      <w:pPr>
+        <w:spacing w:after="60"/>
+      </w:pPr>
+      <w:r>
+        <w:rPr>
+          <w:b/>
+          <w:color w:val="B8966B"/>
+          <w:sz w:val="20"/>
+        </w:rPr>
+        <w:t xml:space="preserve">Availability:  </w:t>
+      </w:r>
+      <w:r>
+        <w:rPr>
+          <w:color w:val="1A1A1A"/>
+          <w:sz w:val="22"/>
+        </w:rPr>
+        <w:t>Limited — reserve early to confirm your spot</w:t>
+      </w:r>
+    </w:p>
+    <w:p>
+      <w:pPr>
+        <w:spacing w:before="200" w:after="40"/>
+        <w:jc w:val="left"/>
+      </w:pPr>
+    </w:p>
+    <w:p>
+      <w:pPr>
+        <w:spacing w:before="160" w:after="80"/>
+      </w:pPr>
+      <w:r>
+        <w:rPr>
+          <w:b/>
+          <w:color w:val="B8966B"/>
+          <w:sz w:val="20"/>
+        </w:rPr>
+        <w:t xml:space="preserve">Pricing:  </w:t>
+      </w:r>
+      <w:r>
+        <w:rPr>
+          <w:b/>
+          <w:color w:val="1A1A1A"/>
+          <w:sz w:val="24"/>
+        </w:rPr>
+        <w:t>From $6,950 per guest, all-inclusive ex-flights.</w:t>
+      </w:r>
+    </w:p>
+    <w:p>
+      <w:pPr>
+        <w:spacing w:before="0" w:after="280"/>
         <w:jc w:val="left"/>
       </w:pPr>
       <w:r>
         <w:rPr>
-          <w:rFonts w:ascii="Garamond" w:hAnsi="Garamond"/>
           <w:b w:val="0"/>
-          <w:i w:val="0"/>
-          <w:color w:val="1B4332"/>
-          <w:sz w:val="44"/>
+          <w:i/>
+          <w:color w:val="6B6B6B"/>
+          <w:sz w:val="18"/>
         </w:rPr>
-        <w:t>Everything You Need to Know.</w:t>
-      </w:r>
-    </w:p>
-    <w:tbl>
-      <w:tblPr>
-        <w:tblStyle w:val="TableGrid"/>
-        <w:tblW w:type="auto" w:w="0"/>
-        <w:tblLook w:firstColumn="1" w:firstRow="1" w:lastColumn="0" w:lastRow="0" w:noHBand="0" w:noVBand="1" w:val="04A0"/>
-      </w:tblPr>
-      <w:tblGrid>
-        <w:gridCol w:w="4320"/>
-        <w:gridCol w:w="4320"/>
-      </w:tblGrid>
-      <w:tr>
-        <w:tc>
-          <w:tcPr>
-            <w:tcW w:type="dxa" w:w="2592"/>
-            <w:tcBorders>
-              <w:top w:val="single" w:sz="4" w:color="DDDDDD"/>
-              <w:left w:val="single" w:sz="4" w:color="DDDDDD"/>
-              <w:bottom w:val="single" w:sz="4" w:color="DDDDDD"/>
-              <w:right w:val="single" w:sz="4" w:color="DDDDDD"/>
-            </w:tcBorders>
-          </w:tcPr>
-          <w:p>
-            <w:pPr>
-              <w:spacing w:before="80" w:after="80"/>
-            </w:pPr>
-            <w:r>
-              <w:rPr>
-                <w:rFonts w:ascii="Calibri" w:hAnsi="Calibri"/>
-                <w:b/>
-                <w:color w:val="B8966B"/>
-                <w:sz w:val="17"/>
-              </w:rPr>
-              <w:t>EVENT</w:t>
-            </w:r>
-          </w:p>
-        </w:tc>
-        <w:tc>
-          <w:tcPr>
-            <w:tcW w:type="dxa" w:w="4320"/>
-            <w:tcBorders>
-              <w:top w:val="single" w:sz="4" w:color="DDDDDD"/>
-              <w:left w:val="single" w:sz="4" w:color="DDDDDD"/>
-              <w:bottom w:val="single" w:sz="4" w:color="DDDDDD"/>
-              <w:right w:val="single" w:sz="4" w:color="DDDDDD"/>
-            </w:tcBorders>
-          </w:tcPr>
-          <w:p>
-            <w:pPr>
-              <w:spacing w:before="80" w:after="80"/>
-            </w:pPr>
-            <w:r>
-              <w:rPr>
-                <w:rFonts w:ascii="Calibri" w:hAnsi="Calibri"/>
-                <w:color w:val="1A1A1A"/>
-                <w:sz w:val="21"/>
-              </w:rPr>
-              <w:t>England vs South Africa — Third Test</w:t>
-            </w:r>
-          </w:p>
-        </w:tc>
-      </w:tr>
-      <w:tr>
-        <w:tc>
-          <w:tcPr>
-            <w:tcW w:type="dxa" w:w="2592"/>
-            <w:tcBorders>
-              <w:top w:val="single" w:sz="4" w:color="DDDDDD"/>
-              <w:left w:val="single" w:sz="4" w:color="DDDDDD"/>
-              <w:bottom w:val="single" w:sz="4" w:color="DDDDDD"/>
-              <w:right w:val="single" w:sz="4" w:color="DDDDDD"/>
-            </w:tcBorders>
-          </w:tcPr>
-          <w:p>
-            <w:pPr>
-              <w:spacing w:before="80" w:after="80"/>
-            </w:pPr>
-            <w:r>
-              <w:rPr>
-                <w:rFonts w:ascii="Calibri" w:hAnsi="Calibri"/>
-                <w:b/>
-                <w:color w:val="B8966B"/>
-                <w:sz w:val="17"/>
-              </w:rPr>
-              <w:t>VENUE</w:t>
-            </w:r>
-          </w:p>
-        </w:tc>
-        <w:tc>
-          <w:tcPr>
-            <w:tcW w:type="dxa" w:w="4320"/>
-            <w:tcBorders>
-              <w:top w:val="single" w:sz="4" w:color="DDDDDD"/>
-              <w:left w:val="single" w:sz="4" w:color="DDDDDD"/>
-              <w:bottom w:val="single" w:sz="4" w:color="DDDDDD"/>
-              <w:right w:val="single" w:sz="4" w:color="DDDDDD"/>
-            </w:tcBorders>
-          </w:tcPr>
-          <w:p>
-            <w:pPr>
-              <w:spacing w:before="80" w:after="80"/>
-            </w:pPr>
-            <w:r>
-              <w:rPr>
-                <w:rFonts w:ascii="Calibri" w:hAnsi="Calibri"/>
-                <w:color w:val="1A1A1A"/>
-                <w:sz w:val="21"/>
-              </w:rPr>
-              <w:t>Newlands Cricket Ground, Cape Town</w:t>
-            </w:r>
-          </w:p>
-        </w:tc>
-      </w:tr>
-      <w:tr>
-        <w:tc>
-          <w:tcPr>
-            <w:tcW w:type="dxa" w:w="2592"/>
-            <w:tcBorders>
-              <w:top w:val="single" w:sz="4" w:color="DDDDDD"/>
-              <w:left w:val="single" w:sz="4" w:color="DDDDDD"/>
-              <w:bottom w:val="single" w:sz="4" w:color="DDDDDD"/>
-              <w:right w:val="single" w:sz="4" w:color="DDDDDD"/>
-            </w:tcBorders>
-          </w:tcPr>
-          <w:p>
-            <w:pPr>
-              <w:spacing w:before="80" w:after="80"/>
-            </w:pPr>
-            <w:r>
-              <w:rPr>
-                <w:rFonts w:ascii="Calibri" w:hAnsi="Calibri"/>
-                <w:b/>
-                <w:color w:val="B8966B"/>
-                <w:sz w:val="17"/>
-              </w:rPr>
-              <w:t>PACKAGE DATES</w:t>
-            </w:r>
-          </w:p>
-        </w:tc>
-        <w:tc>
-          <w:tcPr>
-            <w:tcW w:type="dxa" w:w="4320"/>
-            <w:tcBorders>
-              <w:top w:val="single" w:sz="4" w:color="DDDDDD"/>
-              <w:left w:val="single" w:sz="4" w:color="DDDDDD"/>
-              <w:bottom w:val="single" w:sz="4" w:color="DDDDDD"/>
-              <w:right w:val="single" w:sz="4" w:color="DDDDDD"/>
-            </w:tcBorders>
-          </w:tcPr>
-          <w:p>
-            <w:pPr>
-              <w:spacing w:before="80" w:after="80"/>
-            </w:pPr>
-            <w:r>
-              <w:rPr>
-                <w:rFonts w:ascii="Calibri" w:hAnsi="Calibri"/>
-                <w:color w:val="1A1A1A"/>
-                <w:sz w:val="21"/>
-              </w:rPr>
-              <w:t>December 29, 2026 – January 7, 2027</w:t>
-            </w:r>
-          </w:p>
-        </w:tc>
-      </w:tr>
-      <w:tr>
-        <w:tc>
-          <w:tcPr>
-            <w:tcW w:type="dxa" w:w="2592"/>
-            <w:tcBorders>
-              <w:top w:val="single" w:sz="4" w:color="DDDDDD"/>
-              <w:left w:val="single" w:sz="4" w:color="DDDDDD"/>
-              <w:bottom w:val="single" w:sz="4" w:color="DDDDDD"/>
-              <w:right w:val="single" w:sz="4" w:color="DDDDDD"/>
-            </w:tcBorders>
-          </w:tcPr>
-          <w:p>
-            <w:pPr>
-              <w:spacing w:before="80" w:after="80"/>
-            </w:pPr>
-            <w:r>
-              <w:rPr>
-                <w:rFonts w:ascii="Calibri" w:hAnsi="Calibri"/>
-                <w:b/>
-                <w:color w:val="B8966B"/>
-                <w:sz w:val="17"/>
-              </w:rPr>
-              <w:t>DURATION</w:t>
-            </w:r>
-          </w:p>
-        </w:tc>
-        <w:tc>
-          <w:tcPr>
-            <w:tcW w:type="dxa" w:w="4320"/>
-            <w:tcBorders>
-              <w:top w:val="single" w:sz="4" w:color="DDDDDD"/>
-              <w:left w:val="single" w:sz="4" w:color="DDDDDD"/>
-              <w:bottom w:val="single" w:sz="4" w:color="DDDDDD"/>
-              <w:right w:val="single" w:sz="4" w:color="DDDDDD"/>
-            </w:tcBorders>
-          </w:tcPr>
-          <w:p>
-            <w:pPr>
-              <w:spacing w:before="80" w:after="80"/>
-            </w:pPr>
-            <w:r>
-              <w:rPr>
-                <w:rFonts w:ascii="Calibri" w:hAnsi="Calibri"/>
-                <w:color w:val="1A1A1A"/>
-                <w:sz w:val="21"/>
-              </w:rPr>
-              <w:t>10 nights</w:t>
-            </w:r>
-          </w:p>
-        </w:tc>
-      </w:tr>
-      <w:tr>
-        <w:tc>
-          <w:tcPr>
-            <w:tcW w:type="dxa" w:w="2592"/>
-            <w:tcBorders>
-              <w:top w:val="single" w:sz="4" w:color="DDDDDD"/>
-              <w:left w:val="single" w:sz="4" w:color="DDDDDD"/>
-              <w:bottom w:val="single" w:sz="4" w:color="DDDDDD"/>
-              <w:right w:val="single" w:sz="4" w:color="DDDDDD"/>
-            </w:tcBorders>
-          </w:tcPr>
-          <w:p>
-            <w:pPr>
-              <w:spacing w:before="80" w:after="80"/>
-            </w:pPr>
-            <w:r>
-              <w:rPr>
-                <w:rFonts w:ascii="Calibri" w:hAnsi="Calibri"/>
-                <w:b/>
-                <w:color w:val="B8966B"/>
-                <w:sz w:val="17"/>
-              </w:rPr>
-              <w:t>BASE HOTEL</w:t>
-            </w:r>
-          </w:p>
-        </w:tc>
-        <w:tc>
-          <w:tcPr>
-            <w:tcW w:type="dxa" w:w="4320"/>
-            <w:tcBorders>
-              <w:top w:val="single" w:sz="4" w:color="DDDDDD"/>
-              <w:left w:val="single" w:sz="4" w:color="DDDDDD"/>
-              <w:bottom w:val="single" w:sz="4" w:color="DDDDDD"/>
-              <w:right w:val="single" w:sz="4" w:color="DDDDDD"/>
-            </w:tcBorders>
-          </w:tcPr>
-          <w:p>
-            <w:pPr>
-              <w:spacing w:before="80" w:after="80"/>
-            </w:pPr>
-            <w:r>
-              <w:rPr>
-                <w:rFonts w:ascii="Calibri" w:hAnsi="Calibri"/>
-                <w:color w:val="1A1A1A"/>
-                <w:sz w:val="21"/>
-              </w:rPr>
-              <w:t>Hyatt Regency Cape Town</w:t>
-            </w:r>
-          </w:p>
-        </w:tc>
-      </w:tr>
-      <w:tr>
-        <w:tc>
-          <w:tcPr>
-            <w:tcW w:type="dxa" w:w="2592"/>
-            <w:tcBorders>
-              <w:top w:val="single" w:sz="4" w:color="DDDDDD"/>
-              <w:left w:val="single" w:sz="4" w:color="DDDDDD"/>
-              <w:bottom w:val="single" w:sz="4" w:color="DDDDDD"/>
-              <w:right w:val="single" w:sz="4" w:color="DDDDDD"/>
-            </w:tcBorders>
-          </w:tcPr>
-          <w:p>
-            <w:pPr>
-              <w:spacing w:before="80" w:after="80"/>
-            </w:pPr>
-            <w:r>
-              <w:rPr>
-                <w:rFonts w:ascii="Calibri" w:hAnsi="Calibri"/>
-                <w:b/>
-                <w:color w:val="B8966B"/>
-                <w:sz w:val="17"/>
-              </w:rPr>
-              <w:t>CAPACITY</w:t>
-            </w:r>
-          </w:p>
-        </w:tc>
-        <w:tc>
-          <w:tcPr>
-            <w:tcW w:type="dxa" w:w="4320"/>
-            <w:tcBorders>
-              <w:top w:val="single" w:sz="4" w:color="DDDDDD"/>
-              <w:left w:val="single" w:sz="4" w:color="DDDDDD"/>
-              <w:bottom w:val="single" w:sz="4" w:color="DDDDDD"/>
-              <w:right w:val="single" w:sz="4" w:color="DDDDDD"/>
-            </w:tcBorders>
-          </w:tcPr>
-          <w:p>
-            <w:pPr>
-              <w:spacing w:before="80" w:after="80"/>
-            </w:pPr>
-            <w:r>
-              <w:rPr>
-                <w:rFonts w:ascii="Calibri" w:hAnsi="Calibri"/>
-                <w:color w:val="1A1A1A"/>
-                <w:sz w:val="21"/>
-              </w:rPr>
-              <w:t>Limited — inquiry required to confirm availability</w:t>
-            </w:r>
-          </w:p>
-        </w:tc>
-      </w:tr>
-    </w:tbl>
-    <w:p/>
-    <w:p>
-      <w:pPr>
-        <w:spacing w:before="200" w:after="80"/>
-      </w:pPr>
-      <w:r>
-        <w:rPr>
-          <w:rFonts w:ascii="Garamond" w:hAnsi="Garamond"/>
-          <w:color w:val="1A1A1A"/>
-          <w:sz w:val="32"/>
-        </w:rPr>
-        <w:t>Why this package</w:t>
+        <w:t>[NOTE FOR COLIN: ZAR equivalent in brackets — FX peg to be confirmed before this goes to Ashley.]</w:t>
       </w:r>
     </w:p>
     <w:p>
       <w:pPr>
-        <w:spacing w:before="0" w:after="120"/>
+        <w:spacing w:before="280" w:after="80"/>
         <w:jc w:val="left"/>
       </w:pPr>
       <w:r>
         <w:rPr>
-          <w:rFonts w:ascii="Calibri" w:hAnsi="Calibri"/>
+          <w:b/>
+          <w:color w:val="1A1A1A"/>
+          <w:sz w:val="28"/>
+        </w:rPr>
+        <w:t>Why This Package</w:t>
+      </w:r>
+    </w:p>
+    <w:p>
+      <w:pPr>
+        <w:spacing w:before="80" w:after="160"/>
+        <w:jc w:val="left"/>
+      </w:pPr>
+      <w:r>
+        <w:rPr>
+          <w:b w:val="0"/>
           <w:i w:val="0"/>
-          <w:color w:val="6B6B6B"/>
+          <w:color w:val="1A1A1A"/>
           <w:sz w:val="22"/>
         </w:rPr>
         <w:t>This package exists because the best sports travel is never only about the sport. Cape Town in late December earns its place regardless of what happens at Newlands. The cricket is what makes it specific. The city is what makes it memorable.</w:t>
@@ -1553,78 +1186,74 @@
       </w:pPr>
       <w:r>
         <w:rPr>
-          <w:rFonts w:ascii="Calibri" w:hAnsi="Calibri"/>
+          <w:b w:val="0"/>
           <w:i w:val="0"/>
-          <w:color w:val="6B6B6B"/>
+          <w:color w:val="1A1A1A"/>
           <w:sz w:val="22"/>
         </w:rPr>
-        <w:t>If you're considering it, inquire early.</w:t>
+        <w:t>Capacity is limited. Reserve early.</w:t>
       </w:r>
     </w:p>
     <w:p>
       <w:pPr>
-        <w:spacing w:before="120" w:after="120"/>
+        <w:spacing w:before="160" w:after="160"/>
         <w:pBdr>
-          <w:bottom w:val="single" w:sz="6" w:space="1" w:color="B8966B"/>
+          <w:bottom w:val="single" w:sz="4" w:space="1" w:color="B8966B"/>
         </w:pBdr>
       </w:pPr>
     </w:p>
     <w:p>
       <w:pPr>
-        <w:spacing w:before="200" w:after="80"/>
+        <w:spacing w:before="280" w:after="120"/>
+        <w:jc w:val="left"/>
       </w:pPr>
       <w:r>
         <w:rPr>
-          <w:rFonts w:ascii="Calibri" w:hAnsi="Calibri"/>
           <w:b/>
-          <w:i w:val="0"/>
-          <w:color w:val="B8966B"/>
-          <w:sz w:val="17"/>
+          <w:color w:val="1A1A1A"/>
+          <w:sz w:val="44"/>
         </w:rPr>
-        <w:t>RESERVE YOUR SPOT</w:t>
+        <w:t>Reserve Your Spot</w:t>
       </w:r>
     </w:p>
     <w:p>
       <w:pPr>
-        <w:spacing w:before="80" w:after="160"/>
-        <w:jc w:val="center"/>
+        <w:spacing w:before="0" w:after="160"/>
+        <w:jc w:val="left"/>
       </w:pPr>
       <w:r>
         <w:rPr>
-          <w:rFonts w:ascii="Garamond" w:hAnsi="Garamond"/>
-          <w:b w:val="0"/>
+          <w:b/>
           <w:i w:val="0"/>
-          <w:color w:val="1B4332"/>
-          <w:sz w:val="44"/>
+          <w:color w:val="B8966B"/>
+          <w:sz w:val="24"/>
         </w:rPr>
-        <w:t>Reserve your place</w:t>
-        <w:br/>
-        <w:t>before the suite fills.</w:t>
+        <w:t>Suite capped at 24 guests — once it’s full, it’s full.</w:t>
       </w:r>
     </w:p>
     <w:p>
       <w:pPr>
-        <w:spacing w:before="0" w:after="120"/>
-        <w:jc w:val="center"/>
+        <w:spacing w:before="0" w:after="160"/>
+        <w:jc w:val="left"/>
       </w:pPr>
       <w:r>
         <w:rPr>
-          <w:rFonts w:ascii="Calibri" w:hAnsi="Calibri"/>
+          <w:b w:val="0"/>
           <w:i w:val="0"/>
-          <w:color w:val="6B6B6B"/>
+          <w:color w:val="1A1A1A"/>
           <w:sz w:val="22"/>
         </w:rPr>
-        <w:t>This package is available to a limited number of guests. To request a full proposal or confirm availability, contact the Eventra team directly.</w:t>
+        <w:t>This package is available to a limited number of travelers. To request a full proposal or confirm availability, contact the Eventra team directly.</w:t>
       </w:r>
     </w:p>
     <w:p>
       <w:pPr>
         <w:spacing w:before="0" w:after="240"/>
-        <w:jc w:val="center"/>
+        <w:jc w:val="left"/>
       </w:pPr>
       <w:r>
         <w:rPr>
-          <w:rFonts w:ascii="Calibri" w:hAnsi="Calibri"/>
+          <w:b w:val="0"/>
           <w:i/>
           <w:color w:val="6B6B6B"/>
           <w:sz w:val="22"/>
@@ -1634,90 +1263,60 @@
     </w:p>
     <w:p>
       <w:pPr>
-        <w:spacing w:before="80" w:after="80"/>
-        <w:jc w:val="center"/>
+        <w:spacing w:before="0" w:after="80"/>
+        <w:jc w:val="left"/>
       </w:pPr>
       <w:r>
         <w:rPr>
-          <w:rFonts w:ascii="Garamond" w:hAnsi="Garamond"/>
           <w:b/>
-          <w:color w:val="1B4332"/>
-          <w:sz w:val="32"/>
+          <w:i w:val="0"/>
+          <w:color w:val="B8966B"/>
+          <w:sz w:val="26"/>
         </w:rPr>
-        <w:t>From $6,950 per guest, all-inclusive ex-flights.</w:t>
+        <w:t>►  hello@eventragroup.co.za</w:t>
       </w:r>
     </w:p>
     <w:p>
       <w:pPr>
-        <w:spacing w:before="0" w:after="160"/>
-        <w:jc w:val="center"/>
+        <w:spacing w:before="0" w:after="280"/>
+        <w:jc w:val="left"/>
       </w:pPr>
       <w:r>
         <w:rPr>
-          <w:rFonts w:ascii="Calibri" w:hAnsi="Calibri"/>
-          <w:i/>
-          <w:color w:val="6B6B6B"/>
-          <w:sz w:val="18"/>
+          <w:b w:val="0"/>
+          <w:i w:val="0"/>
+          <w:color w:val="1A1A1A"/>
+          <w:sz w:val="22"/>
         </w:rPr>
-        <w:t>[ZAR equivalent: TBC — confirm FX peg with Colin before sending]</w:t>
+        <w:t>►  Reserve Your Spot  |  Eventra Group USA  |  Ashley Horobin</w:t>
       </w:r>
     </w:p>
     <w:p>
       <w:pPr>
-        <w:spacing w:before="0" w:after="160"/>
-        <w:jc w:val="center"/>
-      </w:pPr>
-      <w:r>
-        <w:rPr>
-          <w:rFonts w:ascii="Calibri" w:hAnsi="Calibri"/>
-          <w:b/>
-          <w:color w:val="1A1A1A"/>
-          <w:sz w:val="22"/>
-        </w:rPr>
-        <w:t>Suite capped at 24 guests — once it's full, it's full.</w:t>
-      </w:r>
-    </w:p>
-    <w:p>
-      <w:pPr>
-        <w:spacing w:before="80" w:after="80"/>
-        <w:jc w:val="center"/>
-      </w:pPr>
-      <w:r>
-        <w:rPr>
-          <w:rFonts w:ascii="Calibri" w:hAnsi="Calibri"/>
-          <w:b/>
-          <w:color w:val="B8966B"/>
-          <w:sz w:val="22"/>
-        </w:rPr>
-        <w:t>→  RESERVE YOUR SPOT  ·  ashley@eventragroup.com</w:t>
-      </w:r>
-    </w:p>
-    <w:p>
-      <w:pPr>
-        <w:spacing w:before="120" w:after="120"/>
+        <w:spacing w:before="160" w:after="160"/>
         <w:pBdr>
-          <w:bottom w:val="single" w:sz="6" w:space="1" w:color="B8966B"/>
+          <w:bottom w:val="single" w:sz="4" w:space="1" w:color="B8966B"/>
         </w:pBdr>
       </w:pPr>
     </w:p>
     <w:p>
       <w:pPr>
-        <w:spacing w:before="160" w:after="80"/>
-        <w:jc w:val="center"/>
+        <w:spacing w:before="160" w:after="0"/>
+        <w:jc w:val="left"/>
       </w:pPr>
       <w:r>
         <w:rPr>
-          <w:rFonts w:ascii="Calibri" w:hAnsi="Calibri"/>
+          <w:b w:val="0"/>
           <w:i/>
           <w:color w:val="6B6B6B"/>
-          <w:sz w:val="17"/>
+          <w:sz w:val="18"/>
         </w:rPr>
-        <w:t>Prepared by Eventra Group  ·  eventragroup.com  ·  For Ashley Horobin, Eventra Group USA  ·  Confidential — not for distribution  ·  Back to Colin for review before sending.</w:t>
+        <w:t>Newlands_2027_US_Version_v1  —  Eventra Group  —  Back to Colin for review before distribution to Ashley Horobin.</w:t>
       </w:r>
     </w:p>
     <w:sectPr>
       <w:pgSz w:w="12240" w:h="15840"/>
-      <w:pgMar w:top="1584" w:right="1800" w:bottom="1584" w:left="1800" w:header="720" w:footer="720" w:gutter="0"/>
+      <w:pgMar w:top="1417" w:right="1701" w:bottom="1417" w:left="1701" w:header="720" w:footer="720" w:gutter="0"/>
       <w:cols w:space="720"/>
       <w:docGrid w:linePitch="360"/>
     </w:sectPr>

</xml_diff>